<commit_message>
feat: implement comprehensive Neo4j agent skill framework and expand ESG knowledge base documentation
</commit_message>
<xml_diff>
--- a/Projects/ESG/z7922273643230_c01d5f4b9255f83ce61089c240a7530f.docx
+++ b/Projects/ESG/z7922273643230_c01d5f4b9255f83ce61089c240a7530f.docx
@@ -91,7 +91,10 @@
         <w:t>4</w:t>
       </w:r>
       <w:r>
-        <w:t xml:space="preserve">/2021 </w:t>
+        <w:t>/2021</w:t>
+      </w:r>
+      <w:r>
+        <w:t>. Nơi cấp: phòng cảnh sát  Quảng Ninh</w:t>
       </w:r>
     </w:p>
     <w:p>
@@ -101,7 +104,25 @@
     </w:p>
     <w:p>
       <w:r>
-        <w:t>Tôi xin trình bày vụ việc như sau: Vào hồi 12 giờ 20 phút ngày 11/05/2026, sau khi hết giờ làm việc buổi sáng, tôi có việc về nhà. Trong lúc đang nấu ăn, tôi không may bị máy xay cắt vào tay, được người nhà đưa đi cấp cứu tại Bệnh viện Đa khoa Tỉnh Quảng Ninh. Tại đây, tôi được bác sĩ khám và chẩn đoán: Tổn thương ngón áp út bàn tay phải và khâu vết thương phần mềm dài dưới 10cm. Tôi điều trị ngoại trú từ ngày 11/05/2026 đến hết ngày 20/05/2026.</w:t>
+        <w:t xml:space="preserve">Tôi xin trình bày </w:t>
+      </w:r>
+      <w:r>
+        <w:t>sự</w:t>
+      </w:r>
+      <w:r>
+        <w:t xml:space="preserve"> việc như sau: Vào hồi 12 giờ </w:t>
+      </w:r>
+      <w:r>
+        <w:t>3</w:t>
+      </w:r>
+      <w:r>
+        <w:t xml:space="preserve">0 phút ngày 11/05/2026, sau khi hết giờ làm việc buổi sáng, tôi có việc về nhà. Trong lúc </w:t>
+      </w:r>
+      <w:r>
+        <w:t>sử dụng máy xay</w:t>
+      </w:r>
+      <w:r>
+        <w:t>, tôi không may bị cắt vào tay, được người nhà đưa đi cấp cứu tại Bệnh viện Đa khoa Tỉnh Quảng Ninh. Tại đây, tôi được bác sĩ khám và chẩn đoán: Tổn thương ngón áp út bàn tay phải và khâu vết thương phần mềm dài dưới 10cm. Tôi điều trị ngoại trú từ ngày 11/05/2026 đến hết ngày 20/05/2026.</w:t>
       </w:r>
     </w:p>
     <w:p>
@@ -169,12 +190,6 @@
       <w:pPr>
         <w:jc w:val="right"/>
       </w:pPr>
-      <w:r>
-        <w:rPr>
-          <w:b/>
-        </w:rPr>
-        <w:t>Lưu Thị Lan</w:t>
-      </w:r>
     </w:p>
     <w:sectPr>
       <w:pgSz w:w="12240" w:h="15840"/>

</xml_diff>